<commit_message>
Add default Simple Mode, GitHub Issues tracking and project acceptance checks
</commit_message>
<xml_diff>
--- a/PCS_3.0_Handbook.docx
+++ b/PCS_3.0_Handbook.docx
@@ -2,6 +2,19 @@
 <file path=word/document.xml><?xml version="1.0" encoding="utf-8"?>
 <w:document xmlns:wpc="http://schemas.microsoft.com/office/word/2010/wordprocessingCanvas" xmlns:mo="http://schemas.microsoft.com/office/mac/office/2008/main" xmlns:mc="http://schemas.openxmlformats.org/markup-compatibility/2006" xmlns:mv="urn:schemas-microsoft-com:mac:vml" xmlns:o="urn:schemas-microsoft-com:office:office" xmlns:r="http://schemas.openxmlformats.org/officeDocument/2006/relationships" xmlns:m="http://schemas.openxmlformats.org/officeDocument/2006/math" xmlns:v="urn:schemas-microsoft-com:vml" xmlns:wp14="http://schemas.microsoft.com/office/word/2010/wordprocessingDrawing" xmlns:wp="http://schemas.openxmlformats.org/drawingml/2006/wordprocessingDrawing" xmlns:w10="urn:schemas-microsoft-com:office:word" xmlns:w="http://schemas.openxmlformats.org/wordprocessingml/2006/main" xmlns:w14="http://schemas.microsoft.com/office/word/2010/wordml" xmlns:wpg="http://schemas.microsoft.com/office/word/2010/wordprocessingGroup" xmlns:wpi="http://schemas.microsoft.com/office/word/2010/wordprocessingInk" xmlns:wne="http://schemas.microsoft.com/office/word/2006/wordml" xmlns:wps="http://schemas.microsoft.com/office/word/2010/wordprocessingShape" mc:Ignorable="w14 wp14">
   <w:body>
+    <w:p>
+      <w:pPr>
+        <w:spacing w:after="240"/>
+      </w:pPr>
+      <w:r>
+        <w:rPr>
+          <w:b/>
+          <w:color w:val="1E5A7D"/>
+          <w:sz w:val="20"/>
+        </w:rPr>
+        <w:t>CHẾ ĐỘ ĐƠN GIẢN (MẶC ĐỊNH): Mở PROMPT.md trên GitHub, sao chép vào ChatGPT/Claude/Gemini và cung cấp SRS hoặc yêu cầu. KHÔNG cần làm các bước cấu hình GitHub App, Inbox, Gateway, CLI bên dưới. Các phần cài đặt chi tiết trong sổ tay chỉ dành cho Advanced Mode khi thực sự cần.</w:t>
+      </w:r>
+    </w:p>
     <w:p>
       <w:pPr>
         <w:pStyle w:val="Title"/>

</xml_diff>

<commit_message>
PCS 3.0.2: Simple Mode default and project governance
</commit_message>
<xml_diff>
--- a/PCS_3.0_Handbook.docx
+++ b/PCS_3.0_Handbook.docx
@@ -2,6 +2,19 @@
 <file path=word/document.xml><?xml version="1.0" encoding="utf-8"?>
 <w:document xmlns:wpc="http://schemas.microsoft.com/office/word/2010/wordprocessingCanvas" xmlns:mo="http://schemas.microsoft.com/office/mac/office/2008/main" xmlns:mc="http://schemas.openxmlformats.org/markup-compatibility/2006" xmlns:mv="urn:schemas-microsoft-com:mac:vml" xmlns:o="urn:schemas-microsoft-com:office:office" xmlns:r="http://schemas.openxmlformats.org/officeDocument/2006/relationships" xmlns:m="http://schemas.openxmlformats.org/officeDocument/2006/math" xmlns:v="urn:schemas-microsoft-com:vml" xmlns:wp14="http://schemas.microsoft.com/office/word/2010/wordprocessingDrawing" xmlns:wp="http://schemas.openxmlformats.org/drawingml/2006/wordprocessingDrawing" xmlns:w10="urn:schemas-microsoft-com:office:word" xmlns:w="http://schemas.openxmlformats.org/wordprocessingml/2006/main" xmlns:w14="http://schemas.microsoft.com/office/word/2010/wordml" xmlns:wpg="http://schemas.microsoft.com/office/word/2010/wordprocessingGroup" xmlns:wpi="http://schemas.microsoft.com/office/word/2010/wordprocessingInk" xmlns:wne="http://schemas.microsoft.com/office/word/2006/wordml" xmlns:wps="http://schemas.microsoft.com/office/word/2010/wordprocessingShape" mc:Ignorable="w14 wp14">
   <w:body>
+    <w:p>
+      <w:pPr>
+        <w:spacing w:after="240"/>
+      </w:pPr>
+      <w:r>
+        <w:rPr>
+          <w:b/>
+          <w:color w:val="1E5A7D"/>
+          <w:sz w:val="20"/>
+        </w:rPr>
+        <w:t>CHẾ ĐỘ ĐƠN GIẢN (MẶC ĐỊNH): Mở PROMPT.md trên GitHub, sao chép vào ChatGPT/Claude/Gemini và cung cấp SRS hoặc yêu cầu. KHÔNG cần làm các bước cấu hình GitHub App, Inbox, Gateway, CLI bên dưới. Các phần cài đặt chi tiết trong sổ tay chỉ dành cho Advanced Mode khi thực sự cần.</w:t>
+      </w:r>
+    </w:p>
     <w:p>
       <w:pPr>
         <w:pStyle w:val="Title"/>

</xml_diff>